<commit_message>
constructPath 처리 추가 (path minMax bbox 추출)
</commit_message>
<xml_diff>
--- a/test/out_pdf_editable/예약이체_편집가능.docx
+++ b/test/out_pdf_editable/예약이체_편집가능.docx
@@ -53,6 +53,7 @@
           <w:p>
             <w:r>
               <w:rPr>
+                <w:color w:val="000000"/>
                 <w:sz w:val="20"/>
                 <w:szCs w:val="20"/>
               </w:rPr>
@@ -67,6 +68,7 @@
           <w:p>
             <w:r>
               <w:rPr>
+                <w:color w:val="000000"/>
                 <w:sz w:val="20"/>
                 <w:szCs w:val="20"/>
               </w:rPr>
@@ -81,6 +83,7 @@
           <w:p>
             <w:r>
               <w:rPr>
+                <w:color w:val="000000"/>
                 <w:sz w:val="20"/>
                 <w:szCs w:val="20"/>
               </w:rPr>
@@ -95,6 +98,7 @@
           <w:p>
             <w:r>
               <w:rPr>
+                <w:color w:val="000000"/>
                 <w:sz w:val="20"/>
                 <w:szCs w:val="20"/>
               </w:rPr>
@@ -109,6 +113,7 @@
           <w:p>
             <w:r>
               <w:rPr>
+                <w:color w:val="000000"/>
                 <w:sz w:val="20"/>
                 <w:szCs w:val="20"/>
               </w:rPr>
@@ -123,6 +128,7 @@
           <w:p>
             <w:r>
               <w:rPr>
+                <w:color w:val="000000"/>
                 <w:sz w:val="20"/>
                 <w:szCs w:val="20"/>
               </w:rPr>
@@ -137,6 +143,7 @@
           <w:p>
             <w:r>
               <w:rPr>
+                <w:color w:val="000000"/>
                 <w:sz w:val="20"/>
                 <w:szCs w:val="20"/>
               </w:rPr>
@@ -151,6 +158,7 @@
           <w:p>
             <w:r>
               <w:rPr>
+                <w:color w:val="000000"/>
                 <w:sz w:val="20"/>
                 <w:szCs w:val="20"/>
               </w:rPr>
@@ -165,6 +173,7 @@
           <w:p>
             <w:r>
               <w:rPr>
+                <w:color w:val="000000"/>
                 <w:sz w:val="20"/>
                 <w:szCs w:val="20"/>
               </w:rPr>
@@ -179,6 +188,7 @@
           <w:p>
             <w:r>
               <w:rPr>
+                <w:color w:val="000000"/>
                 <w:sz w:val="20"/>
                 <w:szCs w:val="20"/>
               </w:rPr>
@@ -193,6 +203,7 @@
           <w:p>
             <w:r>
               <w:rPr>
+                <w:color w:val="000000"/>
                 <w:sz w:val="20"/>
                 <w:szCs w:val="20"/>
               </w:rPr>
@@ -209,6 +220,7 @@
           <w:p>
             <w:r>
               <w:rPr>
+                <w:color w:val="000000"/>
                 <w:sz w:val="20"/>
                 <w:szCs w:val="20"/>
               </w:rPr>
@@ -223,6 +235,7 @@
           <w:p>
             <w:r>
               <w:rPr>
+                <w:color w:val="000000"/>
                 <w:sz w:val="20"/>
                 <w:szCs w:val="20"/>
               </w:rPr>
@@ -237,6 +250,7 @@
           <w:p>
             <w:r>
               <w:rPr>
+                <w:color w:val="000000"/>
                 <w:sz w:val="20"/>
                 <w:szCs w:val="20"/>
               </w:rPr>
@@ -251,6 +265,7 @@
           <w:p>
             <w:r>
               <w:rPr>
+                <w:color w:val="000000"/>
                 <w:sz w:val="20"/>
                 <w:szCs w:val="20"/>
               </w:rPr>
@@ -265,6 +280,7 @@
           <w:p>
             <w:r>
               <w:rPr>
+                <w:color w:val="000000"/>
                 <w:sz w:val="20"/>
                 <w:szCs w:val="20"/>
               </w:rPr>
@@ -279,6 +295,7 @@
           <w:p>
             <w:r>
               <w:rPr>
+                <w:color w:val="000000"/>
                 <w:sz w:val="20"/>
                 <w:szCs w:val="20"/>
               </w:rPr>
@@ -293,6 +310,7 @@
           <w:p>
             <w:r>
               <w:rPr>
+                <w:color w:val="000000"/>
                 <w:sz w:val="20"/>
                 <w:szCs w:val="20"/>
               </w:rPr>
@@ -307,6 +325,7 @@
           <w:p>
             <w:r>
               <w:rPr>
+                <w:color w:val="000000"/>
                 <w:sz w:val="20"/>
                 <w:szCs w:val="20"/>
               </w:rPr>
@@ -321,6 +340,7 @@
           <w:p>
             <w:r>
               <w:rPr>
+                <w:color w:val="000000"/>
                 <w:sz w:val="20"/>
                 <w:szCs w:val="20"/>
               </w:rPr>
@@ -335,6 +355,7 @@
           <w:p>
             <w:r>
               <w:rPr>
+                <w:color w:val="000000"/>
                 <w:sz w:val="20"/>
                 <w:szCs w:val="20"/>
               </w:rPr>
@@ -349,6 +370,7 @@
           <w:p>
             <w:r>
               <w:rPr>
+                <w:color w:val="000000"/>
                 <w:sz w:val="20"/>
                 <w:szCs w:val="20"/>
               </w:rPr>
@@ -365,6 +387,7 @@
           <w:p>
             <w:r>
               <w:rPr>
+                <w:color w:val="000000"/>
                 <w:sz w:val="20"/>
                 <w:szCs w:val="20"/>
               </w:rPr>
@@ -379,6 +402,7 @@
           <w:p>
             <w:r>
               <w:rPr>
+                <w:color w:val="000000"/>
                 <w:sz w:val="20"/>
                 <w:szCs w:val="20"/>
               </w:rPr>
@@ -393,6 +417,7 @@
           <w:p>
             <w:r>
               <w:rPr>
+                <w:color w:val="000000"/>
                 <w:sz w:val="20"/>
                 <w:szCs w:val="20"/>
               </w:rPr>
@@ -407,6 +432,7 @@
           <w:p>
             <w:r>
               <w:rPr>
+                <w:color w:val="000000"/>
                 <w:sz w:val="20"/>
                 <w:szCs w:val="20"/>
               </w:rPr>
@@ -421,6 +447,7 @@
           <w:p>
             <w:r>
               <w:rPr>
+                <w:color w:val="000000"/>
                 <w:sz w:val="20"/>
                 <w:szCs w:val="20"/>
               </w:rPr>
@@ -435,6 +462,7 @@
           <w:p>
             <w:r>
               <w:rPr>
+                <w:color w:val="000000"/>
                 <w:sz w:val="20"/>
                 <w:szCs w:val="20"/>
               </w:rPr>
@@ -449,6 +477,7 @@
           <w:p>
             <w:r>
               <w:rPr>
+                <w:color w:val="000000"/>
                 <w:sz w:val="20"/>
                 <w:szCs w:val="20"/>
               </w:rPr>
@@ -463,6 +492,7 @@
           <w:p>
             <w:r>
               <w:rPr>
+                <w:color w:val="000000"/>
                 <w:sz w:val="20"/>
                 <w:szCs w:val="20"/>
               </w:rPr>
@@ -477,6 +507,7 @@
           <w:p>
             <w:r>
               <w:rPr>
+                <w:color w:val="000000"/>
                 <w:sz w:val="20"/>
                 <w:szCs w:val="20"/>
               </w:rPr>
@@ -491,6 +522,7 @@
           <w:p>
             <w:r>
               <w:rPr>
+                <w:color w:val="000000"/>
                 <w:sz w:val="20"/>
                 <w:szCs w:val="20"/>
               </w:rPr>
@@ -505,6 +537,7 @@
           <w:p>
             <w:r>
               <w:rPr>
+                <w:color w:val="000000"/>
                 <w:sz w:val="20"/>
                 <w:szCs w:val="20"/>
               </w:rPr>
@@ -521,6 +554,7 @@
           <w:p>
             <w:r>
               <w:rPr>
+                <w:color w:val="000000"/>
                 <w:sz w:val="20"/>
                 <w:szCs w:val="20"/>
               </w:rPr>
@@ -535,6 +569,7 @@
           <w:p>
             <w:r>
               <w:rPr>
+                <w:color w:val="000000"/>
                 <w:sz w:val="20"/>
                 <w:szCs w:val="20"/>
               </w:rPr>
@@ -549,6 +584,7 @@
           <w:p>
             <w:r>
               <w:rPr>
+                <w:color w:val="000000"/>
                 <w:sz w:val="20"/>
                 <w:szCs w:val="20"/>
               </w:rPr>
@@ -563,6 +599,7 @@
           <w:p>
             <w:r>
               <w:rPr>
+                <w:color w:val="000000"/>
                 <w:sz w:val="20"/>
                 <w:szCs w:val="20"/>
               </w:rPr>
@@ -577,6 +614,7 @@
           <w:p>
             <w:r>
               <w:rPr>
+                <w:color w:val="000000"/>
                 <w:sz w:val="20"/>
                 <w:szCs w:val="20"/>
               </w:rPr>
@@ -591,6 +629,7 @@
           <w:p>
             <w:r>
               <w:rPr>
+                <w:color w:val="000000"/>
                 <w:sz w:val="20"/>
                 <w:szCs w:val="20"/>
               </w:rPr>
@@ -605,6 +644,7 @@
           <w:p>
             <w:r>
               <w:rPr>
+                <w:color w:val="000000"/>
                 <w:sz w:val="20"/>
                 <w:szCs w:val="20"/>
               </w:rPr>
@@ -619,6 +659,7 @@
           <w:p>
             <w:r>
               <w:rPr>
+                <w:color w:val="000000"/>
                 <w:sz w:val="20"/>
                 <w:szCs w:val="20"/>
               </w:rPr>
@@ -633,6 +674,7 @@
           <w:p>
             <w:r>
               <w:rPr>
+                <w:color w:val="000000"/>
                 <w:sz w:val="20"/>
                 <w:szCs w:val="20"/>
               </w:rPr>
@@ -647,6 +689,7 @@
           <w:p>
             <w:r>
               <w:rPr>
+                <w:color w:val="000000"/>
                 <w:sz w:val="20"/>
                 <w:szCs w:val="20"/>
               </w:rPr>
@@ -661,6 +704,7 @@
           <w:p>
             <w:r>
               <w:rPr>
+                <w:color w:val="000000"/>
                 <w:sz w:val="20"/>
                 <w:szCs w:val="20"/>
               </w:rPr>
@@ -677,6 +721,7 @@
           <w:p>
             <w:r>
               <w:rPr>
+                <w:color w:val="000000"/>
                 <w:sz w:val="20"/>
                 <w:szCs w:val="20"/>
               </w:rPr>
@@ -691,6 +736,7 @@
           <w:p>
             <w:r>
               <w:rPr>
+                <w:color w:val="000000"/>
                 <w:sz w:val="20"/>
                 <w:szCs w:val="20"/>
               </w:rPr>
@@ -705,6 +751,7 @@
           <w:p>
             <w:r>
               <w:rPr>
+                <w:color w:val="000000"/>
                 <w:sz w:val="20"/>
                 <w:szCs w:val="20"/>
               </w:rPr>
@@ -719,6 +766,7 @@
           <w:p>
             <w:r>
               <w:rPr>
+                <w:color w:val="000000"/>
                 <w:sz w:val="20"/>
                 <w:szCs w:val="20"/>
               </w:rPr>
@@ -733,6 +781,7 @@
           <w:p>
             <w:r>
               <w:rPr>
+                <w:color w:val="000000"/>
                 <w:sz w:val="20"/>
                 <w:szCs w:val="20"/>
               </w:rPr>
@@ -747,6 +796,7 @@
           <w:p>
             <w:r>
               <w:rPr>
+                <w:color w:val="000000"/>
                 <w:sz w:val="20"/>
                 <w:szCs w:val="20"/>
               </w:rPr>
@@ -761,6 +811,7 @@
           <w:p>
             <w:r>
               <w:rPr>
+                <w:color w:val="000000"/>
                 <w:sz w:val="20"/>
                 <w:szCs w:val="20"/>
               </w:rPr>
@@ -775,6 +826,7 @@
           <w:p>
             <w:r>
               <w:rPr>
+                <w:color w:val="000000"/>
                 <w:sz w:val="20"/>
                 <w:szCs w:val="20"/>
               </w:rPr>
@@ -789,6 +841,7 @@
           <w:p>
             <w:r>
               <w:rPr>
+                <w:color w:val="000000"/>
                 <w:sz w:val="20"/>
                 <w:szCs w:val="20"/>
               </w:rPr>
@@ -803,6 +856,7 @@
           <w:p>
             <w:r>
               <w:rPr>
+                <w:color w:val="000000"/>
                 <w:sz w:val="20"/>
                 <w:szCs w:val="20"/>
               </w:rPr>
@@ -817,6 +871,7 @@
           <w:p>
             <w:r>
               <w:rPr>
+                <w:color w:val="000000"/>
                 <w:sz w:val="20"/>
                 <w:szCs w:val="20"/>
               </w:rPr>
@@ -833,6 +888,7 @@
           <w:p>
             <w:r>
               <w:rPr>
+                <w:color w:val="000000"/>
                 <w:sz w:val="20"/>
                 <w:szCs w:val="20"/>
               </w:rPr>
@@ -847,6 +903,7 @@
           <w:p>
             <w:r>
               <w:rPr>
+                <w:color w:val="000000"/>
                 <w:sz w:val="20"/>
                 <w:szCs w:val="20"/>
               </w:rPr>
@@ -861,6 +918,7 @@
           <w:p>
             <w:r>
               <w:rPr>
+                <w:color w:val="000000"/>
                 <w:sz w:val="20"/>
                 <w:szCs w:val="20"/>
               </w:rPr>
@@ -875,6 +933,7 @@
           <w:p>
             <w:r>
               <w:rPr>
+                <w:color w:val="000000"/>
                 <w:sz w:val="20"/>
                 <w:szCs w:val="20"/>
               </w:rPr>
@@ -889,6 +948,7 @@
           <w:p>
             <w:r>
               <w:rPr>
+                <w:color w:val="000000"/>
                 <w:sz w:val="20"/>
                 <w:szCs w:val="20"/>
               </w:rPr>
@@ -903,6 +963,7 @@
           <w:p>
             <w:r>
               <w:rPr>
+                <w:color w:val="000000"/>
                 <w:sz w:val="20"/>
                 <w:szCs w:val="20"/>
               </w:rPr>
@@ -917,6 +978,7 @@
           <w:p>
             <w:r>
               <w:rPr>
+                <w:color w:val="000000"/>
                 <w:sz w:val="20"/>
                 <w:szCs w:val="20"/>
               </w:rPr>
@@ -931,6 +993,7 @@
           <w:p>
             <w:r>
               <w:rPr>
+                <w:color w:val="000000"/>
                 <w:sz w:val="20"/>
                 <w:szCs w:val="20"/>
               </w:rPr>
@@ -945,6 +1008,7 @@
           <w:p>
             <w:r>
               <w:rPr>
+                <w:color w:val="000000"/>
                 <w:sz w:val="20"/>
                 <w:szCs w:val="20"/>
               </w:rPr>
@@ -959,6 +1023,7 @@
           <w:p>
             <w:r>
               <w:rPr>
+                <w:color w:val="000000"/>
                 <w:sz w:val="20"/>
                 <w:szCs w:val="20"/>
               </w:rPr>
@@ -973,6 +1038,7 @@
           <w:p>
             <w:r>
               <w:rPr>
+                <w:color w:val="000000"/>
                 <w:sz w:val="20"/>
                 <w:szCs w:val="20"/>
               </w:rPr>

</xml_diff>